<commit_message>
Removed torch from sensitivities files
</commit_message>
<xml_diff>
--- a/Slides/Comparison_VaryingTemp.docx
+++ b/Slides/Comparison_VaryingTemp.docx
@@ -10,20 +10,20 @@
         <w:tblLook w:val="04A0" w:firstRow="1" w:lastRow="0" w:firstColumn="1" w:lastColumn="0" w:noHBand="0" w:noVBand="1"/>
       </w:tblPr>
       <w:tblGrid>
-        <w:gridCol w:w="4503"/>
-        <w:gridCol w:w="4949"/>
+        <w:gridCol w:w="4320"/>
+        <w:gridCol w:w="5132"/>
         <w:gridCol w:w="5218"/>
       </w:tblGrid>
       <w:tr>
         <w:tc>
           <w:tcPr>
-            <w:tcW w:w="4504" w:type="dxa"/>
+            <w:tcW w:w="4320" w:type="dxa"/>
           </w:tcPr>
           <w:p/>
         </w:tc>
         <w:tc>
           <w:tcPr>
-            <w:tcW w:w="4949" w:type="dxa"/>
+            <w:tcW w:w="5132" w:type="dxa"/>
           </w:tcPr>
           <w:p>
             <w:pPr>
@@ -44,7 +44,7 @@
         </w:tc>
         <w:tc>
           <w:tcPr>
-            <w:tcW w:w="5217" w:type="dxa"/>
+            <w:tcW w:w="5218" w:type="dxa"/>
           </w:tcPr>
           <w:p>
             <w:pPr>
@@ -67,23 +67,21 @@
       <w:tr>
         <w:tc>
           <w:tcPr>
-            <w:tcW w:w="4504" w:type="dxa"/>
+            <w:tcW w:w="4320" w:type="dxa"/>
           </w:tcPr>
           <w:p>
-            <w:proofErr w:type="spellStart"/>
             <w:r>
               <w:t>LBracket_Compliance_Mass</w:t>
             </w:r>
-            <w:proofErr w:type="spellEnd"/>
           </w:p>
         </w:tc>
         <w:tc>
           <w:tcPr>
-            <w:tcW w:w="4946" w:type="dxa"/>
+            <w:tcW w:w="5132" w:type="dxa"/>
           </w:tcPr>
           <w:p>
             <w:r>
-              <w:t>Total optimization time: 157.09 seconds</w:t>
+              <w:t>Total optimization time: 154.70 seconds</w:t>
             </w:r>
           </w:p>
           <w:p>
@@ -108,12 +106,12 @@
           </w:p>
           <w:p>
             <w:r>
-              <w:t>Percentage grey elements: 2.37%</w:t>
-            </w:r>
-          </w:p>
-          <w:p>
-            <w:r>
-              <w:t>Min. Objective (COMPLIANCE): 52.9</w:t>
+              <w:t>Percentage grey elements: 2.63%</w:t>
+            </w:r>
+          </w:p>
+          <w:p>
+            <w:r>
+              <w:t>Min. Objective (COMPLIANCE): 14.5</w:t>
             </w:r>
           </w:p>
           <w:p>
@@ -123,56 +121,449 @@
           </w:p>
           <w:p>
             <w:r>
-              <w:t>Number of elements exceeding Temp Limit: 2 out of 4480</w:t>
-            </w:r>
-          </w:p>
-          <w:p/>
-          <w:p>
-            <w:r>
-              <w:rPr>
-                <w:noProof/>
-              </w:rPr>
-              <w:drawing>
-                <wp:inline distT="0" distB="0" distL="0" distR="0" wp14:anchorId="1AE4BDDE" wp14:editId="5454BC2C">
-                  <wp:extent cx="2324301" cy="2324301"/>
-                  <wp:effectExtent l="0" t="0" r="0" b="0"/>
-                  <wp:docPr id="240786175" name="Picture 1"/>
-                  <wp:cNvGraphicFramePr>
-                    <a:graphicFrameLocks xmlns:a="http://schemas.openxmlformats.org/drawingml/2006/main" noChangeAspect="1"/>
-                  </wp:cNvGraphicFramePr>
-                  <a:graphic xmlns:a="http://schemas.openxmlformats.org/drawingml/2006/main">
-                    <a:graphicData uri="http://schemas.openxmlformats.org/drawingml/2006/picture">
-                      <pic:pic xmlns:pic="http://schemas.openxmlformats.org/drawingml/2006/picture">
-                        <pic:nvPicPr>
-                          <pic:cNvPr id="240786175" name=""/>
-                          <pic:cNvPicPr/>
-                        </pic:nvPicPr>
-                        <pic:blipFill>
-                          <a:blip r:embed="rId4"/>
-                          <a:stretch>
-                            <a:fillRect/>
-                          </a:stretch>
-                        </pic:blipFill>
-                        <pic:spPr>
-                          <a:xfrm>
-                            <a:off x="0" y="0"/>
-                            <a:ext cx="2324301" cy="2324301"/>
-                          </a:xfrm>
-                          <a:prstGeom prst="rect">
-                            <a:avLst/>
-                          </a:prstGeom>
-                        </pic:spPr>
-                      </pic:pic>
-                    </a:graphicData>
-                  </a:graphic>
-                </wp:inline>
-              </w:drawing>
+              <w:t>#Elements exceeding Temp Limit: 24 / 4480</w:t>
             </w:r>
           </w:p>
         </w:tc>
         <w:tc>
           <w:tcPr>
-            <w:tcW w:w="5220" w:type="dxa"/>
+            <w:tcW w:w="5218" w:type="dxa"/>
+          </w:tcPr>
+          <w:p>
+            <w:r>
+              <w:t>Total optimization time: 155.33 seconds</w:t>
+            </w:r>
+          </w:p>
+          <w:p>
+            <w:r>
+              <w:t>--------------------------------------------------</w:t>
+            </w:r>
+          </w:p>
+          <w:p>
+            <w:r>
+              <w:t>After snapping:</w:t>
+            </w:r>
+          </w:p>
+          <w:p>
+            <w:r>
+              <w:t>--------------------------------------------------</w:t>
+            </w:r>
+          </w:p>
+          <w:p>
+            <w:r>
+              <w:t>-------------- Iteration 151 -----------------</w:t>
+            </w:r>
+          </w:p>
+          <w:p>
+            <w:r>
+              <w:t>Percentage grey elements: 2.95%</w:t>
+            </w:r>
+          </w:p>
+          <w:p>
+            <w:r>
+              <w:t>Min. Objective (COMPLIANCE): 14.6</w:t>
+            </w:r>
+          </w:p>
+          <w:p>
+            <w:r>
+              <w:t>Constraint 1 (MASS): 24.9 &lt;= 25?</w:t>
+            </w:r>
+          </w:p>
+          <w:p>
+            <w:r>
+              <w:t>#Elements exceeding Temp Limit: 20 / 4480</w:t>
+            </w:r>
+          </w:p>
+        </w:tc>
+      </w:tr>
+    </w:tbl>
+    <w:p>
+      <w:r>
+        <w:br w:type="page"/>
+      </w:r>
+    </w:p>
+    <w:tbl>
+      <w:tblPr>
+        <w:tblStyle w:val="TableGrid"/>
+        <w:tblW w:w="14670" w:type="dxa"/>
+        <w:tblInd w:w="-275" w:type="dxa"/>
+        <w:tblLook w:val="04A0" w:firstRow="1" w:lastRow="0" w:firstColumn="1" w:lastColumn="0" w:noHBand="0" w:noVBand="1"/>
+      </w:tblPr>
+      <w:tblGrid>
+        <w:gridCol w:w="4320"/>
+        <w:gridCol w:w="5132"/>
+        <w:gridCol w:w="5218"/>
+      </w:tblGrid>
+      <w:tr>
+        <w:tc>
+          <w:tcPr>
+            <w:tcW w:w="4320" w:type="dxa"/>
+          </w:tcPr>
+          <w:p>
+            <w:r>
+              <w:lastRenderedPageBreak/>
+              <w:t>LBracket_Compliance_MassCost</w:t>
+            </w:r>
+          </w:p>
+          <w:p/>
+        </w:tc>
+        <w:tc>
+          <w:tcPr>
+            <w:tcW w:w="5132" w:type="dxa"/>
+          </w:tcPr>
+          <w:p>
+            <w:r>
+              <w:t>Total optimization time: 167.59 seconds</w:t>
+            </w:r>
+          </w:p>
+          <w:p>
+            <w:r>
+              <w:t>--------------------------------------------------</w:t>
+            </w:r>
+          </w:p>
+          <w:p>
+            <w:r>
+              <w:t>After snapping:</w:t>
+            </w:r>
+          </w:p>
+          <w:p>
+            <w:r>
+              <w:t>--------------------------------------------------</w:t>
+            </w:r>
+          </w:p>
+          <w:p>
+            <w:r>
+              <w:t>-------------- Iteration 151 -----------------</w:t>
+            </w:r>
+          </w:p>
+          <w:p>
+            <w:r>
+              <w:t>Percentage grey elements: 2.10%</w:t>
+            </w:r>
+          </w:p>
+          <w:p>
+            <w:r>
+              <w:t>Min. Objective (COMPLIANCE): 16.9</w:t>
+            </w:r>
+          </w:p>
+          <w:p>
+            <w:r>
+              <w:t>Constraint 1 (MASS): 20.7 &lt;= 25?</w:t>
+            </w:r>
+          </w:p>
+          <w:p>
+            <w:r>
+              <w:t>Constraint 2 (COST): 200 &lt;= 200?</w:t>
+            </w:r>
+          </w:p>
+          <w:p>
+            <w:r>
+              <w:t>#Elements exceeding Temp Limit: 48 / 4480</w:t>
+            </w:r>
+          </w:p>
+        </w:tc>
+        <w:tc>
+          <w:tcPr>
+            <w:tcW w:w="5218" w:type="dxa"/>
+          </w:tcPr>
+          <w:p>
+            <w:r>
+              <w:t>Total optimization time: 168.29 seconds</w:t>
+            </w:r>
+          </w:p>
+          <w:p>
+            <w:r>
+              <w:t>--------------------------------------------------</w:t>
+            </w:r>
+          </w:p>
+          <w:p>
+            <w:r>
+              <w:t>After snapping:</w:t>
+            </w:r>
+          </w:p>
+          <w:p>
+            <w:r>
+              <w:t>--------------------------------------------------</w:t>
+            </w:r>
+          </w:p>
+          <w:p>
+            <w:r>
+              <w:t>-------------- Iteration 151 -----------------</w:t>
+            </w:r>
+          </w:p>
+          <w:p>
+            <w:r>
+              <w:t>Percentage grey elements: 2.23%</w:t>
+            </w:r>
+          </w:p>
+          <w:p>
+            <w:r>
+              <w:t>Min. Objective (COMPLIANCE): 16.7</w:t>
+            </w:r>
+          </w:p>
+          <w:p>
+            <w:r>
+              <w:t>Constraint 1 (MASS): 20.5 &lt;= 25?</w:t>
+            </w:r>
+          </w:p>
+          <w:p>
+            <w:r>
+              <w:t>Constraint 2 (COST): 200 &lt;= 200?</w:t>
+            </w:r>
+          </w:p>
+          <w:p>
+            <w:r>
+              <w:t>#Elements exceeding Temp Limit: 36 / 4480</w:t>
+            </w:r>
+          </w:p>
+        </w:tc>
+      </w:tr>
+      <w:tr>
+        <w:tc>
+          <w:tcPr>
+            <w:tcW w:w="4320" w:type="dxa"/>
+          </w:tcPr>
+          <w:p>
+            <w:r>
+              <w:t>LBracket_Mass_StressFF</w:t>
+            </w:r>
+            <w:r>
+              <w:t>_Compliance</w:t>
+            </w:r>
+          </w:p>
+          <w:p/>
+        </w:tc>
+        <w:tc>
+          <w:tcPr>
+            <w:tcW w:w="5132" w:type="dxa"/>
+          </w:tcPr>
+          <w:p>
+            <w:r>
+              <w:t>Total optimization time: 390.90 seconds</w:t>
+            </w:r>
+          </w:p>
+          <w:p>
+            <w:r>
+              <w:t>--------------------------------------------------</w:t>
+            </w:r>
+          </w:p>
+          <w:p>
+            <w:r>
+              <w:t>After snapping:</w:t>
+            </w:r>
+          </w:p>
+          <w:p>
+            <w:r>
+              <w:t>--------------------------------------------------</w:t>
+            </w:r>
+          </w:p>
+          <w:p>
+            <w:r>
+              <w:t>-------------- Iteration 151 -----------------</w:t>
+            </w:r>
+          </w:p>
+          <w:p>
+            <w:r>
+              <w:t>Percentage grey elements: 2.54%</w:t>
+            </w:r>
+          </w:p>
+          <w:p>
+            <w:r>
+              <w:t>Min. Objective (MASS): 15.6</w:t>
+            </w:r>
+          </w:p>
+          <w:p>
+            <w:r>
+              <w:t>Constraint 1 (STRESS_</w:t>
+            </w:r>
+            <w:r>
+              <w:t>FF</w:t>
+            </w:r>
+            <w:r>
+              <w:t>): 0.0773 &lt;= 1?</w:t>
+            </w:r>
+          </w:p>
+          <w:p>
+            <w:r>
+              <w:t>Constraint 2 (COMPLIANCE): 0.0499 &lt;= 0.05?</w:t>
+            </w:r>
+          </w:p>
+          <w:p>
+            <w:r>
+              <w:t>#Elements exceeding Temp Limit: 10 / 8360</w:t>
+            </w:r>
+          </w:p>
+        </w:tc>
+        <w:tc>
+          <w:tcPr>
+            <w:tcW w:w="5218" w:type="dxa"/>
+          </w:tcPr>
+          <w:p>
+            <w:r>
+              <w:t>Total optimization time: 387.25 seconds</w:t>
+            </w:r>
+          </w:p>
+          <w:p>
+            <w:r>
+              <w:t>--------------------------------------------------</w:t>
+            </w:r>
+          </w:p>
+          <w:p>
+            <w:r>
+              <w:t>After snapping:</w:t>
+            </w:r>
+          </w:p>
+          <w:p>
+            <w:r>
+              <w:t>--------------------------------------------------</w:t>
+            </w:r>
+          </w:p>
+          <w:p>
+            <w:r>
+              <w:t>-------------- Iteration 151 -----------------</w:t>
+            </w:r>
+          </w:p>
+          <w:p>
+            <w:r>
+              <w:t>Percentage grey elements: 2.39%</w:t>
+            </w:r>
+          </w:p>
+          <w:p>
+            <w:r>
+              <w:t>Min. Objective (MASS): 15.8</w:t>
+            </w:r>
+          </w:p>
+          <w:p>
+            <w:r>
+              <w:t>Constraint 1 (STRESS_</w:t>
+            </w:r>
+            <w:r>
+              <w:t>FF</w:t>
+            </w:r>
+            <w:r>
+              <w:t>): 0.0842 &lt;= 1?</w:t>
+            </w:r>
+          </w:p>
+          <w:p>
+            <w:r>
+              <w:t>Constraint 2 (COMPLIANCE): 0.0501 &lt;= 0.05?</w:t>
+            </w:r>
+          </w:p>
+          <w:p>
+            <w:r>
+              <w:t>#Elements exceeding Temp Limit: 16 / 8360</w:t>
+            </w:r>
+          </w:p>
+        </w:tc>
+      </w:tr>
+      <w:tr>
+        <w:tc>
+          <w:tcPr>
+            <w:tcW w:w="4320" w:type="dxa"/>
+          </w:tcPr>
+          <w:p>
+            <w:r>
+              <w:t>LBracket_Mass_MultipleConstraints</w:t>
+            </w:r>
+          </w:p>
+          <w:p/>
+        </w:tc>
+        <w:tc>
+          <w:tcPr>
+            <w:tcW w:w="5132" w:type="dxa"/>
+          </w:tcPr>
+          <w:p>
+            <w:r>
+              <w:t>Total optimization time: 514.30 seconds</w:t>
+            </w:r>
+          </w:p>
+          <w:p>
+            <w:r>
+              <w:t>--------------------------------------------------</w:t>
+            </w:r>
+          </w:p>
+          <w:p>
+            <w:r>
+              <w:t>After snapping:</w:t>
+            </w:r>
+          </w:p>
+          <w:p>
+            <w:r>
+              <w:t>--------------------------------------------------</w:t>
+            </w:r>
+          </w:p>
+          <w:p>
+            <w:r>
+              <w:t>-------------- Iteration 151 -----------------</w:t>
+            </w:r>
+          </w:p>
+          <w:p>
+            <w:r>
+              <w:t>Percentage grey elements: 1.53%</w:t>
+            </w:r>
+          </w:p>
+          <w:p>
+            <w:r>
+              <w:t>Min. Objective (MASS): 27.4</w:t>
+            </w:r>
+          </w:p>
+          <w:p>
+            <w:r>
+              <w:t>Constraint 1 (STRESS_</w:t>
+            </w:r>
+            <w:r>
+              <w:t>FF</w:t>
+            </w:r>
+            <w:r>
+              <w:t>): 0.657 &lt;= 0.8?</w:t>
+            </w:r>
+          </w:p>
+          <w:p>
+            <w:r>
+              <w:t>Constraint 2 (FATIGUE_</w:t>
+            </w:r>
+            <w:r>
+              <w:t>FF</w:t>
+            </w:r>
+            <w:r>
+              <w:t>): 0.0785 &lt;= 1?</w:t>
+            </w:r>
+          </w:p>
+          <w:p>
+            <w:r>
+              <w:t>Constraint 3 (TEMPERATURE_</w:t>
+            </w:r>
+            <w:r>
+              <w:t>FF</w:t>
+            </w:r>
+            <w:r>
+              <w:t>): 0.415 &lt;= 1?</w:t>
+            </w:r>
+          </w:p>
+          <w:p>
+            <w:r>
+              <w:t>Constraint 4 (MEAN_CRITICALITY): 0.113 &lt;= 1?</w:t>
+            </w:r>
+          </w:p>
+          <w:p>
+            <w:r>
+              <w:t>Constraint 5 (PBR): 1.7 &lt;= 1.8?</w:t>
+            </w:r>
+          </w:p>
+          <w:p>
+            <w:r>
+              <w:t>Constraint 6 (COMPLIANCE): 2.58 &lt;= 2.5?</w:t>
+            </w:r>
+          </w:p>
+          <w:p>
+            <w:r>
+              <w:t>#Elements exceeding Temp Limit: 0 / 8360</w:t>
+            </w:r>
+          </w:p>
+        </w:tc>
+        <w:tc>
+          <w:tcPr>
+            <w:tcW w:w="5218" w:type="dxa"/>
           </w:tcPr>
           <w:p/>
         </w:tc>

</xml_diff>